<commit_message>
Updating isotope protocol for filters
</commit_message>
<xml_diff>
--- a/Isotopes_protocol.docx
+++ b/Isotopes_protocol.docx
@@ -459,7 +459,27 @@
           <w:kern w:val="0"/>
           <w14:ligatures w14:val="none"/>
         </w:rPr>
-        <w:t>Using a serological pipette, add 5mL of MilliQ water to a glass scintillation vial. Then, add 5mL of HCl to the same vial. This will produce an exothermic reaction, making the glass vial feel warm. Wait for it to cool before using.</w:t>
+        <w:t xml:space="preserve">Using a serological pipette, add 5mL of </w:t>
+      </w:r>
+      <w:proofErr w:type="spellStart"/>
+      <w:r>
+        <w:rPr>
+          <w:rFonts w:ascii="Times New Roman" w:eastAsia="Times New Roman" w:hAnsi="Times New Roman" w:cs="Times New Roman"/>
+          <w:color w:val="1F2328"/>
+          <w:kern w:val="0"/>
+          <w14:ligatures w14:val="none"/>
+        </w:rPr>
+        <w:t>MilliQ</w:t>
+      </w:r>
+      <w:proofErr w:type="spellEnd"/>
+      <w:r>
+        <w:rPr>
+          <w:rFonts w:ascii="Times New Roman" w:eastAsia="Times New Roman" w:hAnsi="Times New Roman" w:cs="Times New Roman"/>
+          <w:color w:val="1F2328"/>
+          <w:kern w:val="0"/>
+          <w14:ligatures w14:val="none"/>
+        </w:rPr>
+        <w:t xml:space="preserve"> water to a glass scintillation vial. Then, add 5mL of HCl to the same vial. This will produce an exothermic reaction, making the glass vial feel warm. Wait for it to cool before using.</w:t>
       </w:r>
     </w:p>
     <w:p>
@@ -488,6 +508,17 @@
         </w:rPr>
         <w:t>Protocol</w:t>
       </w:r>
+      <w:r>
+        <w:rPr>
+          <w:rFonts w:ascii="Times New Roman" w:eastAsia="Times New Roman" w:hAnsi="Times New Roman" w:cs="Times New Roman"/>
+          <w:b/>
+          <w:bCs/>
+          <w:color w:val="1F2328"/>
+          <w:kern w:val="0"/>
+          <w14:ligatures w14:val="none"/>
+        </w:rPr>
+        <w:t xml:space="preserve"> for lyophilized coral samples</w:t>
+      </w:r>
     </w:p>
     <w:p>
       <w:pPr>
@@ -766,7 +797,25 @@
           <w:kern w:val="0"/>
           <w14:ligatures w14:val="none"/>
         </w:rPr>
-        <w:t>freezer or sitting out, place them in the drying oven at 60°C for 24hrs to make sure they are completely dry</w:t>
+        <w:t xml:space="preserve">freezer or sitting out, place them in the drying oven at 60°C for </w:t>
+      </w:r>
+      <w:r>
+        <w:rPr>
+          <w:rFonts w:ascii="Times New Roman" w:eastAsia="Times New Roman" w:hAnsi="Times New Roman" w:cs="Times New Roman"/>
+          <w:color w:val="1F2328"/>
+          <w:kern w:val="0"/>
+          <w14:ligatures w14:val="none"/>
+        </w:rPr>
+        <w:t xml:space="preserve">at least </w:t>
+      </w:r>
+      <w:r>
+        <w:rPr>
+          <w:rFonts w:ascii="Times New Roman" w:eastAsia="Times New Roman" w:hAnsi="Times New Roman" w:cs="Times New Roman"/>
+          <w:color w:val="1F2328"/>
+          <w:kern w:val="0"/>
+          <w14:ligatures w14:val="none"/>
+        </w:rPr>
+        <w:t>24hrs to make sure they are completely dry</w:t>
       </w:r>
       <w:r>
         <w:rPr>
@@ -834,7 +883,27 @@
           <w:kern w:val="0"/>
           <w14:ligatures w14:val="none"/>
         </w:rPr>
-        <w:t xml:space="preserve"> (ag_capsule_mg). </w:t>
+        <w:t xml:space="preserve"> (</w:t>
+      </w:r>
+      <w:proofErr w:type="spellStart"/>
+      <w:r>
+        <w:rPr>
+          <w:rFonts w:ascii="Times New Roman" w:eastAsia="Times New Roman" w:hAnsi="Times New Roman" w:cs="Times New Roman"/>
+          <w:color w:val="1F2328"/>
+          <w:kern w:val="0"/>
+          <w14:ligatures w14:val="none"/>
+        </w:rPr>
+        <w:t>ag_capsule_mg</w:t>
+      </w:r>
+      <w:proofErr w:type="spellEnd"/>
+      <w:r>
+        <w:rPr>
+          <w:rFonts w:ascii="Times New Roman" w:eastAsia="Times New Roman" w:hAnsi="Times New Roman" w:cs="Times New Roman"/>
+          <w:color w:val="1F2328"/>
+          <w:kern w:val="0"/>
+          <w14:ligatures w14:val="none"/>
+        </w:rPr>
+        <w:t xml:space="preserve">). </w:t>
       </w:r>
       <w:r>
         <w:rPr>
@@ -868,8 +937,19 @@
           <w:kern w:val="0"/>
           <w14:ligatures w14:val="none"/>
         </w:rPr>
-        <w:t>Sterilize any tools you will be using with 70% ethanol/kimwipes</w:t>
-      </w:r>
+        <w:t>Sterilize any tools you will be using with 70% ethanol/</w:t>
+      </w:r>
+      <w:proofErr w:type="spellStart"/>
+      <w:r>
+        <w:rPr>
+          <w:rFonts w:ascii="Times New Roman" w:eastAsia="Times New Roman" w:hAnsi="Times New Roman" w:cs="Times New Roman"/>
+          <w:color w:val="1F2328"/>
+          <w:kern w:val="0"/>
+          <w14:ligatures w14:val="none"/>
+        </w:rPr>
+        <w:t>kimwipes</w:t>
+      </w:r>
+      <w:proofErr w:type="spellEnd"/>
     </w:p>
     <w:p>
       <w:pPr>
@@ -929,14 +1009,25 @@
         </w:rPr>
         <w:t xml:space="preserve"> (</w:t>
       </w:r>
-      <w:r>
-        <w:rPr>
-          <w:rFonts w:ascii="Times New Roman" w:eastAsia="Times New Roman" w:hAnsi="Times New Roman" w:cs="Times New Roman"/>
-          <w:color w:val="1F2328"/>
-          <w:kern w:val="0"/>
-          <w14:ligatures w14:val="none"/>
-        </w:rPr>
-        <w:t>sample_mg)</w:t>
+      <w:proofErr w:type="spellStart"/>
+      <w:r>
+        <w:rPr>
+          <w:rFonts w:ascii="Times New Roman" w:eastAsia="Times New Roman" w:hAnsi="Times New Roman" w:cs="Times New Roman"/>
+          <w:color w:val="1F2328"/>
+          <w:kern w:val="0"/>
+          <w14:ligatures w14:val="none"/>
+        </w:rPr>
+        <w:t>sample_mg</w:t>
+      </w:r>
+      <w:proofErr w:type="spellEnd"/>
+      <w:r>
+        <w:rPr>
+          <w:rFonts w:ascii="Times New Roman" w:eastAsia="Times New Roman" w:hAnsi="Times New Roman" w:cs="Times New Roman"/>
+          <w:color w:val="1F2328"/>
+          <w:kern w:val="0"/>
+          <w14:ligatures w14:val="none"/>
+        </w:rPr>
+        <w:t>)</w:t>
       </w:r>
     </w:p>
     <w:p>
@@ -1167,6 +1258,7 @@
         </w:rPr>
         <w:t>. Record tray location in spreadsheet (</w:t>
       </w:r>
+      <w:proofErr w:type="spellStart"/>
       <w:r>
         <w:rPr>
           <w:rFonts w:ascii="Times New Roman" w:eastAsia="Times New Roman" w:hAnsi="Times New Roman" w:cs="Times New Roman"/>
@@ -1183,7 +1275,17 @@
           <w:kern w:val="0"/>
           <w14:ligatures w14:val="none"/>
         </w:rPr>
-        <w:t>tray_location)</w:t>
+        <w:t>tray_location</w:t>
+      </w:r>
+      <w:proofErr w:type="spellEnd"/>
+      <w:r>
+        <w:rPr>
+          <w:rFonts w:ascii="Times New Roman" w:eastAsia="Times New Roman" w:hAnsi="Times New Roman" w:cs="Times New Roman"/>
+          <w:color w:val="1F2328"/>
+          <w:kern w:val="0"/>
+          <w14:ligatures w14:val="none"/>
+        </w:rPr>
+        <w:t>)</w:t>
       </w:r>
     </w:p>
     <w:p>
@@ -1418,14 +1520,25 @@
         </w:rPr>
         <w:t>Re-weigh acidified samples and record weight (</w:t>
       </w:r>
-      <w:r>
-        <w:rPr>
-          <w:rFonts w:ascii="Times New Roman" w:eastAsia="Times New Roman" w:hAnsi="Times New Roman" w:cs="Times New Roman"/>
-          <w:color w:val="1F2328"/>
-          <w:kern w:val="0"/>
-          <w14:ligatures w14:val="none"/>
-        </w:rPr>
-        <w:t xml:space="preserve">acid_capsule_mg). Subtract </w:t>
+      <w:proofErr w:type="spellStart"/>
+      <w:r>
+        <w:rPr>
+          <w:rFonts w:ascii="Times New Roman" w:eastAsia="Times New Roman" w:hAnsi="Times New Roman" w:cs="Times New Roman"/>
+          <w:color w:val="1F2328"/>
+          <w:kern w:val="0"/>
+          <w14:ligatures w14:val="none"/>
+        </w:rPr>
+        <w:t>acid_capsule_mg</w:t>
+      </w:r>
+      <w:proofErr w:type="spellEnd"/>
+      <w:r>
+        <w:rPr>
+          <w:rFonts w:ascii="Times New Roman" w:eastAsia="Times New Roman" w:hAnsi="Times New Roman" w:cs="Times New Roman"/>
+          <w:color w:val="1F2328"/>
+          <w:kern w:val="0"/>
+          <w14:ligatures w14:val="none"/>
+        </w:rPr>
+        <w:t xml:space="preserve">). Subtract </w:t>
       </w:r>
       <w:r>
         <w:rPr>
@@ -1436,6 +1549,7 @@
         </w:rPr>
         <w:t>your capsule weight (</w:t>
       </w:r>
+      <w:proofErr w:type="spellStart"/>
       <w:r>
         <w:rPr>
           <w:rFonts w:ascii="Times New Roman" w:eastAsia="Times New Roman" w:hAnsi="Times New Roman" w:cs="Times New Roman"/>
@@ -1445,6 +1559,7 @@
         </w:rPr>
         <w:t>ag_capsule_mg</w:t>
       </w:r>
+      <w:proofErr w:type="spellEnd"/>
       <w:r>
         <w:rPr>
           <w:rFonts w:ascii="Times New Roman" w:eastAsia="Times New Roman" w:hAnsi="Times New Roman" w:cs="Times New Roman"/>
@@ -1472,6 +1587,7 @@
         </w:rPr>
         <w:t>this weight (</w:t>
       </w:r>
+      <w:proofErr w:type="spellStart"/>
       <w:r>
         <w:rPr>
           <w:rFonts w:ascii="Times New Roman" w:eastAsia="Times New Roman" w:hAnsi="Times New Roman" w:cs="Times New Roman"/>
@@ -1481,6 +1597,7 @@
         </w:rPr>
         <w:t>acid_capsule_mg</w:t>
       </w:r>
+      <w:proofErr w:type="spellEnd"/>
       <w:r>
         <w:rPr>
           <w:rFonts w:ascii="Times New Roman" w:eastAsia="Times New Roman" w:hAnsi="Times New Roman" w:cs="Times New Roman"/>
@@ -1517,6 +1634,7 @@
         </w:rPr>
         <w:t>your final sample weight (</w:t>
       </w:r>
+      <w:proofErr w:type="spellStart"/>
       <w:r>
         <w:rPr>
           <w:rFonts w:ascii="Times New Roman" w:eastAsia="Times New Roman" w:hAnsi="Times New Roman" w:cs="Times New Roman"/>
@@ -1526,6 +1644,7 @@
         </w:rPr>
         <w:t>acid_sample_mg</w:t>
       </w:r>
+      <w:proofErr w:type="spellEnd"/>
       <w:r>
         <w:rPr>
           <w:rFonts w:ascii="Times New Roman" w:eastAsia="Times New Roman" w:hAnsi="Times New Roman" w:cs="Times New Roman"/>
@@ -1806,7 +1925,21 @@
         <w:rPr>
           <w:rFonts w:ascii="Times New Roman" w:hAnsi="Times New Roman" w:cs="Times New Roman"/>
         </w:rPr>
-        <w:t>Place sample into final labeled plate, record location in tray (final_tray_location). Re-tape plate</w:t>
+        <w:t>Place sample into final labeled plate, record location in tray (</w:t>
+      </w:r>
+      <w:proofErr w:type="spellStart"/>
+      <w:r>
+        <w:rPr>
+          <w:rFonts w:ascii="Times New Roman" w:hAnsi="Times New Roman" w:cs="Times New Roman"/>
+        </w:rPr>
+        <w:t>final_tray_location</w:t>
+      </w:r>
+      <w:proofErr w:type="spellEnd"/>
+      <w:r>
+        <w:rPr>
+          <w:rFonts w:ascii="Times New Roman" w:hAnsi="Times New Roman" w:cs="Times New Roman"/>
+        </w:rPr>
+        <w:t>). Re-tape plate</w:t>
       </w:r>
     </w:p>
     <w:p>
@@ -1976,6 +2109,1657 @@
           <w:t>https://stableisotopefacility.ucdavis.edu/sample-preparation-carbon-and-nitrogen-solids</w:t>
         </w:r>
       </w:hyperlink>
+    </w:p>
+    <w:p>
+      <w:pPr>
+        <w:numPr>
+          <w:ilvl w:val="0"/>
+          <w:numId w:val="3"/>
+        </w:numPr>
+        <w:shd w:val="clear" w:color="auto" w:fill="FFFFFF"/>
+        <w:spacing w:before="240" w:after="240"/>
+        <w:rPr>
+          <w:rFonts w:ascii="Times New Roman" w:eastAsia="Times New Roman" w:hAnsi="Times New Roman" w:cs="Times New Roman"/>
+          <w:color w:val="1F2328"/>
+          <w:kern w:val="0"/>
+          <w14:ligatures w14:val="none"/>
+        </w:rPr>
+      </w:pPr>
+      <w:r>
+        <w:rPr>
+          <w:rFonts w:ascii="Times New Roman" w:eastAsia="Times New Roman" w:hAnsi="Times New Roman" w:cs="Times New Roman"/>
+          <w:b/>
+          <w:bCs/>
+          <w:color w:val="1F2328"/>
+          <w:kern w:val="0"/>
+          <w14:ligatures w14:val="none"/>
+        </w:rPr>
+        <w:t>Protocol</w:t>
+      </w:r>
+      <w:r>
+        <w:rPr>
+          <w:rFonts w:ascii="Times New Roman" w:eastAsia="Times New Roman" w:hAnsi="Times New Roman" w:cs="Times New Roman"/>
+          <w:b/>
+          <w:bCs/>
+          <w:color w:val="1F2328"/>
+          <w:kern w:val="0"/>
+          <w14:ligatures w14:val="none"/>
+        </w:rPr>
+        <w:t xml:space="preserve"> for </w:t>
+      </w:r>
+      <w:r>
+        <w:rPr>
+          <w:rFonts w:ascii="Times New Roman" w:eastAsia="Times New Roman" w:hAnsi="Times New Roman" w:cs="Times New Roman"/>
+          <w:b/>
+          <w:bCs/>
+          <w:color w:val="1F2328"/>
+          <w:kern w:val="0"/>
+          <w14:ligatures w14:val="none"/>
+        </w:rPr>
+        <w:t>filtered water/coral</w:t>
+      </w:r>
+    </w:p>
+    <w:p>
+      <w:pPr>
+        <w:numPr>
+          <w:ilvl w:val="1"/>
+          <w:numId w:val="3"/>
+        </w:numPr>
+        <w:shd w:val="clear" w:color="auto" w:fill="FFFFFF"/>
+        <w:spacing w:before="100" w:beforeAutospacing="1" w:after="100" w:afterAutospacing="1"/>
+        <w:rPr>
+          <w:rFonts w:ascii="Times New Roman" w:eastAsia="Times New Roman" w:hAnsi="Times New Roman" w:cs="Times New Roman"/>
+          <w:color w:val="1F2328"/>
+          <w:kern w:val="0"/>
+          <w14:ligatures w14:val="none"/>
+        </w:rPr>
+      </w:pPr>
+      <w:r>
+        <w:rPr>
+          <w:rFonts w:ascii="Times New Roman" w:eastAsia="Times New Roman" w:hAnsi="Times New Roman" w:cs="Times New Roman"/>
+          <w:color w:val="1F2328"/>
+          <w:kern w:val="0"/>
+          <w14:ligatures w14:val="none"/>
+        </w:rPr>
+        <w:t xml:space="preserve">If </w:t>
+      </w:r>
+      <w:r>
+        <w:rPr>
+          <w:rFonts w:ascii="Times New Roman" w:eastAsia="Times New Roman" w:hAnsi="Times New Roman" w:cs="Times New Roman"/>
+          <w:color w:val="1F2328"/>
+          <w:kern w:val="0"/>
+          <w14:ligatures w14:val="none"/>
+        </w:rPr>
+        <w:t xml:space="preserve">desiccant </w:t>
+      </w:r>
+      <w:r>
+        <w:rPr>
+          <w:rFonts w:ascii="Times New Roman" w:eastAsia="Times New Roman" w:hAnsi="Times New Roman" w:cs="Times New Roman"/>
+          <w:color w:val="1F2328"/>
+          <w:kern w:val="0"/>
+          <w14:ligatures w14:val="none"/>
+        </w:rPr>
+        <w:t xml:space="preserve">in desiccator </w:t>
+      </w:r>
+      <w:r>
+        <w:rPr>
+          <w:rFonts w:ascii="Times New Roman" w:eastAsia="Times New Roman" w:hAnsi="Times New Roman" w:cs="Times New Roman"/>
+          <w:color w:val="1F2328"/>
+          <w:kern w:val="0"/>
+          <w14:ligatures w14:val="none"/>
+        </w:rPr>
+        <w:t xml:space="preserve">has been sitting for a long time, or has been used for 1 </w:t>
+      </w:r>
+      <w:r>
+        <w:rPr>
+          <w:rFonts w:ascii="Times New Roman" w:eastAsia="Times New Roman" w:hAnsi="Times New Roman" w:cs="Times New Roman"/>
+          <w:color w:val="1F2328"/>
+          <w:kern w:val="0"/>
+          <w14:ligatures w14:val="none"/>
+        </w:rPr>
+        <w:t>month</w:t>
+      </w:r>
+      <w:r>
+        <w:rPr>
+          <w:rFonts w:ascii="Times New Roman" w:eastAsia="Times New Roman" w:hAnsi="Times New Roman" w:cs="Times New Roman"/>
+          <w:color w:val="1F2328"/>
+          <w:kern w:val="0"/>
+          <w14:ligatures w14:val="none"/>
+        </w:rPr>
+        <w:t xml:space="preserve"> consistently</w:t>
+      </w:r>
+      <w:r>
+        <w:rPr>
+          <w:rFonts w:ascii="Times New Roman" w:eastAsia="Times New Roman" w:hAnsi="Times New Roman" w:cs="Times New Roman"/>
+          <w:color w:val="1F2328"/>
+          <w:kern w:val="0"/>
+          <w14:ligatures w14:val="none"/>
+        </w:rPr>
+        <w:t>, put in </w:t>
+      </w:r>
+      <w:r>
+        <w:rPr>
+          <w:rFonts w:ascii="Times New Roman" w:eastAsia="Times New Roman" w:hAnsi="Times New Roman" w:cs="Times New Roman"/>
+          <w:color w:val="1F2328"/>
+          <w:kern w:val="0"/>
+          <w14:ligatures w14:val="none"/>
+        </w:rPr>
+        <w:t>drying</w:t>
+      </w:r>
+      <w:r>
+        <w:rPr>
+          <w:rFonts w:ascii="Times New Roman" w:eastAsia="Times New Roman" w:hAnsi="Times New Roman" w:cs="Times New Roman"/>
+          <w:color w:val="1F2328"/>
+          <w:kern w:val="0"/>
+          <w14:ligatures w14:val="none"/>
+        </w:rPr>
+        <w:t xml:space="preserve"> oven at </w:t>
+      </w:r>
+      <w:r>
+        <w:rPr>
+          <w:rFonts w:ascii="Times New Roman" w:eastAsia="Times New Roman" w:hAnsi="Times New Roman" w:cs="Times New Roman"/>
+          <w:color w:val="1F2328"/>
+          <w:kern w:val="0"/>
+          <w14:ligatures w14:val="none"/>
+        </w:rPr>
+        <w:t>12</w:t>
+      </w:r>
+      <w:r>
+        <w:rPr>
+          <w:rFonts w:ascii="Times New Roman" w:eastAsia="Times New Roman" w:hAnsi="Times New Roman" w:cs="Times New Roman"/>
+          <w:color w:val="1F2328"/>
+          <w:kern w:val="0"/>
+          <w14:ligatures w14:val="none"/>
+        </w:rPr>
+        <w:t xml:space="preserve">0°C for </w:t>
+      </w:r>
+      <w:r>
+        <w:rPr>
+          <w:rFonts w:ascii="Times New Roman" w:eastAsia="Times New Roman" w:hAnsi="Times New Roman" w:cs="Times New Roman"/>
+          <w:color w:val="1F2328"/>
+          <w:kern w:val="0"/>
+          <w14:ligatures w14:val="none"/>
+        </w:rPr>
+        <w:t>4 hours</w:t>
+      </w:r>
+      <w:r>
+        <w:rPr>
+          <w:rFonts w:ascii="Times New Roman" w:eastAsia="Times New Roman" w:hAnsi="Times New Roman" w:cs="Times New Roman"/>
+          <w:color w:val="1F2328"/>
+          <w:kern w:val="0"/>
+          <w14:ligatures w14:val="none"/>
+        </w:rPr>
+        <w:t xml:space="preserve"> using </w:t>
+      </w:r>
+      <w:r>
+        <w:rPr>
+          <w:rFonts w:ascii="Times New Roman" w:eastAsia="Times New Roman" w:hAnsi="Times New Roman" w:cs="Times New Roman"/>
+          <w:color w:val="1F2328"/>
+          <w:kern w:val="0"/>
+          <w14:ligatures w14:val="none"/>
+        </w:rPr>
+        <w:t>aluminum</w:t>
+      </w:r>
+      <w:r>
+        <w:rPr>
+          <w:rFonts w:ascii="Times New Roman" w:eastAsia="Times New Roman" w:hAnsi="Times New Roman" w:cs="Times New Roman"/>
+          <w:color w:val="1F2328"/>
+          <w:kern w:val="0"/>
+          <w14:ligatures w14:val="none"/>
+        </w:rPr>
+        <w:t xml:space="preserve"> foil tray</w:t>
+      </w:r>
+      <w:r>
+        <w:rPr>
+          <w:rFonts w:ascii="Times New Roman" w:eastAsia="Times New Roman" w:hAnsi="Times New Roman" w:cs="Times New Roman"/>
+          <w:color w:val="1F2328"/>
+          <w:kern w:val="0"/>
+          <w14:ligatures w14:val="none"/>
+        </w:rPr>
+        <w:t>.</w:t>
+      </w:r>
+    </w:p>
+    <w:p>
+      <w:pPr>
+        <w:numPr>
+          <w:ilvl w:val="1"/>
+          <w:numId w:val="3"/>
+        </w:numPr>
+        <w:shd w:val="clear" w:color="auto" w:fill="FFFFFF"/>
+        <w:spacing w:before="100" w:beforeAutospacing="1" w:after="100" w:afterAutospacing="1"/>
+        <w:rPr>
+          <w:rFonts w:ascii="Times New Roman" w:eastAsia="Times New Roman" w:hAnsi="Times New Roman" w:cs="Times New Roman"/>
+          <w:color w:val="1F2328"/>
+          <w:kern w:val="0"/>
+          <w14:ligatures w14:val="none"/>
+        </w:rPr>
+      </w:pPr>
+      <w:r>
+        <w:rPr>
+          <w:rFonts w:ascii="Times New Roman" w:eastAsia="Times New Roman" w:hAnsi="Times New Roman" w:cs="Times New Roman"/>
+          <w:color w:val="1F2328"/>
+          <w:kern w:val="0"/>
+          <w14:ligatures w14:val="none"/>
+        </w:rPr>
+        <w:lastRenderedPageBreak/>
+        <w:t xml:space="preserve">Obtain </w:t>
+      </w:r>
+      <w:r>
+        <w:rPr>
+          <w:rFonts w:ascii="Times New Roman" w:eastAsia="Times New Roman" w:hAnsi="Times New Roman" w:cs="Times New Roman"/>
+          <w:color w:val="1F2328"/>
+          <w:kern w:val="0"/>
+          <w14:ligatures w14:val="none"/>
+        </w:rPr>
+        <w:t>filters</w:t>
+      </w:r>
+      <w:r>
+        <w:rPr>
+          <w:rFonts w:ascii="Times New Roman" w:eastAsia="Times New Roman" w:hAnsi="Times New Roman" w:cs="Times New Roman"/>
+          <w:color w:val="1F2328"/>
+          <w:kern w:val="0"/>
+          <w14:ligatures w14:val="none"/>
+        </w:rPr>
+        <w:t xml:space="preserve">. If they have been in the freezer or sitting out, place them in the drying oven at 60°C for </w:t>
+      </w:r>
+      <w:r>
+        <w:rPr>
+          <w:rFonts w:ascii="Times New Roman" w:eastAsia="Times New Roman" w:hAnsi="Times New Roman" w:cs="Times New Roman"/>
+          <w:color w:val="1F2328"/>
+          <w:kern w:val="0"/>
+          <w14:ligatures w14:val="none"/>
+        </w:rPr>
+        <w:t xml:space="preserve">at least </w:t>
+      </w:r>
+      <w:r>
+        <w:rPr>
+          <w:rFonts w:ascii="Times New Roman" w:eastAsia="Times New Roman" w:hAnsi="Times New Roman" w:cs="Times New Roman"/>
+          <w:color w:val="1F2328"/>
+          <w:kern w:val="0"/>
+          <w14:ligatures w14:val="none"/>
+        </w:rPr>
+        <w:t>24hrs to make sure they are completely dry.</w:t>
+      </w:r>
+    </w:p>
+    <w:p>
+      <w:pPr>
+        <w:numPr>
+          <w:ilvl w:val="1"/>
+          <w:numId w:val="3"/>
+        </w:numPr>
+        <w:shd w:val="clear" w:color="auto" w:fill="FFFFFF"/>
+        <w:spacing w:before="100" w:beforeAutospacing="1" w:after="100" w:afterAutospacing="1"/>
+        <w:rPr>
+          <w:rFonts w:ascii="Times New Roman" w:eastAsia="Times New Roman" w:hAnsi="Times New Roman" w:cs="Times New Roman"/>
+          <w:color w:val="1F2328"/>
+          <w:kern w:val="0"/>
+          <w14:ligatures w14:val="none"/>
+        </w:rPr>
+      </w:pPr>
+      <w:r>
+        <w:rPr>
+          <w:rFonts w:ascii="Times New Roman" w:eastAsia="Times New Roman" w:hAnsi="Times New Roman" w:cs="Times New Roman"/>
+          <w:color w:val="1F2328"/>
+          <w:kern w:val="0"/>
+          <w14:ligatures w14:val="none"/>
+        </w:rPr>
+        <w:t>Weigh your filters. Subtract this weight from your initial weight.</w:t>
+      </w:r>
+    </w:p>
+    <w:p>
+      <w:pPr>
+        <w:numPr>
+          <w:ilvl w:val="1"/>
+          <w:numId w:val="3"/>
+        </w:numPr>
+        <w:shd w:val="clear" w:color="auto" w:fill="FFFFFF"/>
+        <w:spacing w:before="100" w:beforeAutospacing="1" w:after="100" w:afterAutospacing="1"/>
+        <w:rPr>
+          <w:rFonts w:ascii="Times New Roman" w:eastAsia="Times New Roman" w:hAnsi="Times New Roman" w:cs="Times New Roman"/>
+          <w:color w:val="1F2328"/>
+          <w:kern w:val="0"/>
+          <w14:ligatures w14:val="none"/>
+        </w:rPr>
+      </w:pPr>
+      <w:r>
+        <w:rPr>
+          <w:rFonts w:ascii="Times New Roman" w:eastAsia="Times New Roman" w:hAnsi="Times New Roman" w:cs="Times New Roman"/>
+          <w:color w:val="1F2328"/>
+          <w:kern w:val="0"/>
+          <w14:ligatures w14:val="none"/>
+        </w:rPr>
+        <w:t xml:space="preserve">Using your filter weight, calculate how much “stuff” you have on the filter. Use </w:t>
+      </w:r>
+      <w:r>
+        <w:rPr>
+          <w:rFonts w:ascii="Times New Roman" w:eastAsia="Times New Roman" w:hAnsi="Times New Roman" w:cs="Times New Roman"/>
+          <w:color w:val="1F2328"/>
+          <w:kern w:val="0"/>
+          <w14:ligatures w14:val="none"/>
+        </w:rPr>
+        <w:t xml:space="preserve">this to calculate how much filter you should send: </w:t>
+      </w:r>
+    </w:p>
+    <w:p>
+      <w:pPr>
+        <w:numPr>
+          <w:ilvl w:val="2"/>
+          <w:numId w:val="3"/>
+        </w:numPr>
+        <w:shd w:val="clear" w:color="auto" w:fill="FFFFFF"/>
+        <w:spacing w:before="100" w:beforeAutospacing="1" w:after="100" w:afterAutospacing="1"/>
+        <w:rPr>
+          <w:rFonts w:ascii="Times New Roman" w:eastAsia="Times New Roman" w:hAnsi="Times New Roman" w:cs="Times New Roman"/>
+          <w:color w:val="1F2328"/>
+          <w:kern w:val="0"/>
+          <w14:ligatures w14:val="none"/>
+        </w:rPr>
+      </w:pPr>
+      <w:proofErr w:type="spellStart"/>
+      <w:r>
+        <w:rPr>
+          <w:rFonts w:ascii="Times New Roman" w:hAnsi="Times New Roman" w:cs="Times New Roman"/>
+          <w:color w:val="000000"/>
+        </w:rPr>
+        <w:t>xmg</w:t>
+      </w:r>
+      <w:proofErr w:type="spellEnd"/>
+      <w:r>
+        <w:rPr>
+          <w:rFonts w:ascii="Times New Roman" w:hAnsi="Times New Roman" w:cs="Times New Roman"/>
+          <w:color w:val="000000"/>
+        </w:rPr>
+        <w:t xml:space="preserve"> of "stuff"/</w:t>
+      </w:r>
+      <w:proofErr w:type="spellStart"/>
+      <w:r>
+        <w:rPr>
+          <w:rFonts w:ascii="Times New Roman" w:hAnsi="Times New Roman" w:cs="Times New Roman"/>
+          <w:color w:val="000000"/>
+        </w:rPr>
+        <w:t>xmg</w:t>
+      </w:r>
+      <w:proofErr w:type="spellEnd"/>
+      <w:r>
+        <w:rPr>
+          <w:rFonts w:ascii="Times New Roman" w:hAnsi="Times New Roman" w:cs="Times New Roman"/>
+          <w:color w:val="000000"/>
+        </w:rPr>
+        <w:t xml:space="preserve"> of "filter + stuff" = 3.5mg "stuff"/</w:t>
+      </w:r>
+      <w:proofErr w:type="spellStart"/>
+      <w:r>
+        <w:rPr>
+          <w:rFonts w:ascii="Times New Roman" w:hAnsi="Times New Roman" w:cs="Times New Roman"/>
+          <w:color w:val="000000"/>
+        </w:rPr>
+        <w:t>xmg</w:t>
+      </w:r>
+      <w:proofErr w:type="spellEnd"/>
+      <w:r>
+        <w:rPr>
+          <w:rFonts w:ascii="Times New Roman" w:hAnsi="Times New Roman" w:cs="Times New Roman"/>
+          <w:color w:val="000000"/>
+        </w:rPr>
+        <w:t xml:space="preserve"> of "</w:t>
+      </w:r>
+      <w:proofErr w:type="spellStart"/>
+      <w:r>
+        <w:rPr>
+          <w:rFonts w:ascii="Times New Roman" w:hAnsi="Times New Roman" w:cs="Times New Roman"/>
+          <w:color w:val="000000"/>
+        </w:rPr>
+        <w:t>filter+stuff</w:t>
+      </w:r>
+      <w:proofErr w:type="spellEnd"/>
+      <w:r>
+        <w:rPr>
+          <w:rFonts w:ascii="Times New Roman" w:hAnsi="Times New Roman" w:cs="Times New Roman"/>
+          <w:color w:val="000000"/>
+        </w:rPr>
+        <w:t>"</w:t>
+      </w:r>
+    </w:p>
+    <w:p>
+      <w:pPr>
+        <w:numPr>
+          <w:ilvl w:val="2"/>
+          <w:numId w:val="3"/>
+        </w:numPr>
+        <w:shd w:val="clear" w:color="auto" w:fill="FFFFFF"/>
+        <w:spacing w:before="100" w:beforeAutospacing="1" w:after="100" w:afterAutospacing="1"/>
+        <w:rPr>
+          <w:rFonts w:ascii="Times New Roman" w:eastAsia="Times New Roman" w:hAnsi="Times New Roman" w:cs="Times New Roman"/>
+          <w:color w:val="1F2328"/>
+          <w:kern w:val="0"/>
+          <w14:ligatures w14:val="none"/>
+        </w:rPr>
+      </w:pPr>
+      <w:r>
+        <w:rPr>
+          <w:rFonts w:ascii="Times New Roman" w:hAnsi="Times New Roman" w:cs="Times New Roman"/>
+          <w:color w:val="000000"/>
+        </w:rPr>
+        <w:t>Example: we</w:t>
+      </w:r>
+      <w:r>
+        <w:rPr>
+          <w:rFonts w:ascii="Times New Roman" w:hAnsi="Times New Roman" w:cs="Times New Roman"/>
+          <w:color w:val="000000"/>
+        </w:rPr>
+        <w:t xml:space="preserve"> have 4 filters with sample weights ranging from 58-79mg (~330mg pre-filtration weight and ~400mg post filtration and drying). </w:t>
+      </w:r>
+      <w:r>
+        <w:rPr>
+          <w:rFonts w:ascii="Times New Roman" w:hAnsi="Times New Roman" w:cs="Times New Roman"/>
+          <w:color w:val="000000"/>
+        </w:rPr>
+        <w:t xml:space="preserve">Aim for </w:t>
+      </w:r>
+      <w:r>
+        <w:rPr>
+          <w:rFonts w:ascii="Times New Roman" w:hAnsi="Times New Roman" w:cs="Times New Roman"/>
+          <w:color w:val="000000"/>
+        </w:rPr>
+        <w:t>~30mg of filter + stuff</w:t>
+      </w:r>
+      <w:r>
+        <w:rPr>
+          <w:rFonts w:ascii="Times New Roman" w:hAnsi="Times New Roman" w:cs="Times New Roman"/>
+          <w:color w:val="000000"/>
+        </w:rPr>
+        <w:t xml:space="preserve">. </w:t>
+      </w:r>
+      <w:r>
+        <w:rPr>
+          <w:rFonts w:ascii="Times New Roman" w:hAnsi="Times New Roman" w:cs="Times New Roman"/>
+          <w:color w:val="000000"/>
+        </w:rPr>
+        <w:t>This would hopefully give us ~5mg of stuff. My calculation: ~60mg stuff/400mg filter + stuff = 5mg stuff/</w:t>
+      </w:r>
+      <w:proofErr w:type="spellStart"/>
+      <w:r>
+        <w:rPr>
+          <w:rFonts w:ascii="Times New Roman" w:hAnsi="Times New Roman" w:cs="Times New Roman"/>
+          <w:color w:val="000000"/>
+        </w:rPr>
+        <w:t>Xmg</w:t>
+      </w:r>
+      <w:proofErr w:type="spellEnd"/>
+      <w:r>
+        <w:rPr>
+          <w:rFonts w:ascii="Times New Roman" w:hAnsi="Times New Roman" w:cs="Times New Roman"/>
+          <w:color w:val="000000"/>
+        </w:rPr>
+        <w:t xml:space="preserve"> filter + stuff -&gt; ~30mg. </w:t>
+      </w:r>
+      <w:r>
+        <w:rPr>
+          <w:rFonts w:ascii="Times New Roman" w:hAnsi="Times New Roman" w:cs="Times New Roman"/>
+          <w:color w:val="000000"/>
+        </w:rPr>
+        <w:t>Send</w:t>
+      </w:r>
+      <w:r>
+        <w:rPr>
+          <w:rFonts w:ascii="Times New Roman" w:hAnsi="Times New Roman" w:cs="Times New Roman"/>
+          <w:color w:val="000000"/>
+        </w:rPr>
+        <w:t xml:space="preserve"> duplicate or triplicate samples per filter.</w:t>
+      </w:r>
+    </w:p>
+    <w:p>
+      <w:pPr>
+        <w:numPr>
+          <w:ilvl w:val="2"/>
+          <w:numId w:val="3"/>
+        </w:numPr>
+        <w:shd w:val="clear" w:color="auto" w:fill="FFFFFF"/>
+        <w:spacing w:before="100" w:beforeAutospacing="1" w:after="100" w:afterAutospacing="1"/>
+        <w:rPr>
+          <w:rFonts w:ascii="Times New Roman" w:eastAsia="Times New Roman" w:hAnsi="Times New Roman" w:cs="Times New Roman"/>
+          <w:color w:val="1F2328"/>
+          <w:kern w:val="0"/>
+          <w14:ligatures w14:val="none"/>
+        </w:rPr>
+      </w:pPr>
+      <w:r>
+        <w:rPr>
+          <w:rFonts w:ascii="Times New Roman" w:eastAsia="Times New Roman" w:hAnsi="Times New Roman" w:cs="Times New Roman"/>
+          <w:color w:val="1F2328"/>
+          <w:kern w:val="0"/>
+          <w14:ligatures w14:val="none"/>
+        </w:rPr>
+        <w:t xml:space="preserve">Notes from emailing with Kim (at Cornell Isotope): </w:t>
+      </w:r>
+      <w:r>
+        <w:rPr>
+          <w:rFonts w:ascii="Times New Roman" w:hAnsi="Times New Roman" w:cs="Times New Roman"/>
+          <w:color w:val="000000"/>
+        </w:rPr>
+        <w:t>W</w:t>
+      </w:r>
+      <w:r>
+        <w:rPr>
+          <w:rFonts w:ascii="Times New Roman" w:hAnsi="Times New Roman" w:cs="Times New Roman"/>
+          <w:color w:val="000000"/>
+        </w:rPr>
+        <w:t xml:space="preserve">e usually cut </w:t>
+      </w:r>
+      <w:r>
+        <w:rPr>
+          <w:rFonts w:ascii="Times New Roman" w:hAnsi="Times New Roman" w:cs="Times New Roman"/>
+          <w:color w:val="000000"/>
+        </w:rPr>
+        <w:t>the filters</w:t>
+      </w:r>
+      <w:r>
+        <w:rPr>
+          <w:rFonts w:ascii="Times New Roman" w:hAnsi="Times New Roman" w:cs="Times New Roman"/>
+          <w:color w:val="000000"/>
+        </w:rPr>
+        <w:t xml:space="preserve"> up like a pie and take ’slices’ to get the desired weight. It’s always a guessing game with filters, but I like your math. 5mg is good if it is a mix of organic and inorganic material. If you feel like the 5mg is all organic maybe decrease to 3.5mg </w:t>
+      </w:r>
+      <w:proofErr w:type="spellStart"/>
+      <w:r>
+        <w:rPr>
+          <w:rFonts w:ascii="Times New Roman" w:hAnsi="Times New Roman" w:cs="Times New Roman"/>
+          <w:color w:val="000000"/>
+        </w:rPr>
+        <w:t>ish</w:t>
+      </w:r>
+      <w:proofErr w:type="spellEnd"/>
+      <w:r>
+        <w:rPr>
+          <w:rFonts w:ascii="Times New Roman" w:hAnsi="Times New Roman" w:cs="Times New Roman"/>
+          <w:color w:val="000000"/>
+        </w:rPr>
+        <w:t>.</w:t>
+      </w:r>
+    </w:p>
+    <w:p>
+      <w:pPr>
+        <w:numPr>
+          <w:ilvl w:val="1"/>
+          <w:numId w:val="3"/>
+        </w:numPr>
+        <w:shd w:val="clear" w:color="auto" w:fill="FFFFFF"/>
+        <w:spacing w:before="100" w:beforeAutospacing="1" w:after="100" w:afterAutospacing="1"/>
+        <w:rPr>
+          <w:rFonts w:ascii="Times New Roman" w:eastAsia="Times New Roman" w:hAnsi="Times New Roman" w:cs="Times New Roman"/>
+          <w:color w:val="1F2328"/>
+          <w:kern w:val="0"/>
+          <w14:ligatures w14:val="none"/>
+        </w:rPr>
+      </w:pPr>
+      <w:r>
+        <w:rPr>
+          <w:rFonts w:ascii="Times New Roman" w:eastAsia="Times New Roman" w:hAnsi="Times New Roman" w:cs="Times New Roman"/>
+          <w:color w:val="1F2328"/>
+          <w:kern w:val="0"/>
+          <w14:ligatures w14:val="none"/>
+        </w:rPr>
+        <w:t xml:space="preserve">Get a few pieces of sterile/combusted tinfoil and </w:t>
+      </w:r>
+      <w:proofErr w:type="spellStart"/>
+      <w:r>
+        <w:rPr>
+          <w:rFonts w:ascii="Times New Roman" w:eastAsia="Times New Roman" w:hAnsi="Times New Roman" w:cs="Times New Roman"/>
+          <w:color w:val="1F2328"/>
+          <w:kern w:val="0"/>
+          <w14:ligatures w14:val="none"/>
+        </w:rPr>
+        <w:t>kimwipes</w:t>
+      </w:r>
+      <w:proofErr w:type="spellEnd"/>
+      <w:r>
+        <w:rPr>
+          <w:rFonts w:ascii="Times New Roman" w:eastAsia="Times New Roman" w:hAnsi="Times New Roman" w:cs="Times New Roman"/>
+          <w:color w:val="1F2328"/>
+          <w:kern w:val="0"/>
+          <w14:ligatures w14:val="none"/>
+        </w:rPr>
+        <w:t xml:space="preserve"> to act as your working surface.</w:t>
+      </w:r>
+    </w:p>
+    <w:p>
+      <w:pPr>
+        <w:numPr>
+          <w:ilvl w:val="1"/>
+          <w:numId w:val="3"/>
+        </w:numPr>
+        <w:shd w:val="clear" w:color="auto" w:fill="FFFFFF"/>
+        <w:spacing w:before="100" w:beforeAutospacing="1" w:after="100" w:afterAutospacing="1"/>
+        <w:rPr>
+          <w:rFonts w:ascii="Times New Roman" w:eastAsia="Times New Roman" w:hAnsi="Times New Roman" w:cs="Times New Roman"/>
+          <w:color w:val="1F2328"/>
+          <w:kern w:val="0"/>
+          <w14:ligatures w14:val="none"/>
+        </w:rPr>
+      </w:pPr>
+      <w:r>
+        <w:rPr>
+          <w:rFonts w:ascii="Times New Roman" w:eastAsia="Times New Roman" w:hAnsi="Times New Roman" w:cs="Times New Roman"/>
+          <w:color w:val="1F2328"/>
+          <w:kern w:val="0"/>
+          <w14:ligatures w14:val="none"/>
+        </w:rPr>
+        <w:t xml:space="preserve">Sterilize </w:t>
+      </w:r>
+      <w:r>
+        <w:rPr>
+          <w:rFonts w:ascii="Times New Roman" w:eastAsia="Times New Roman" w:hAnsi="Times New Roman" w:cs="Times New Roman"/>
+          <w:color w:val="1F2328"/>
+          <w:kern w:val="0"/>
+          <w14:ligatures w14:val="none"/>
+        </w:rPr>
+        <w:t>a razor blade and any</w:t>
+      </w:r>
+      <w:r>
+        <w:rPr>
+          <w:rFonts w:ascii="Times New Roman" w:eastAsia="Times New Roman" w:hAnsi="Times New Roman" w:cs="Times New Roman"/>
+          <w:color w:val="1F2328"/>
+          <w:kern w:val="0"/>
+          <w14:ligatures w14:val="none"/>
+        </w:rPr>
+        <w:t xml:space="preserve"> tools you will be using with 70% ethanol/</w:t>
+      </w:r>
+      <w:proofErr w:type="spellStart"/>
+      <w:r>
+        <w:rPr>
+          <w:rFonts w:ascii="Times New Roman" w:eastAsia="Times New Roman" w:hAnsi="Times New Roman" w:cs="Times New Roman"/>
+          <w:color w:val="1F2328"/>
+          <w:kern w:val="0"/>
+          <w14:ligatures w14:val="none"/>
+        </w:rPr>
+        <w:t>kimwipes</w:t>
+      </w:r>
+      <w:proofErr w:type="spellEnd"/>
+    </w:p>
+    <w:p>
+      <w:pPr>
+        <w:numPr>
+          <w:ilvl w:val="1"/>
+          <w:numId w:val="3"/>
+        </w:numPr>
+        <w:shd w:val="clear" w:color="auto" w:fill="FFFFFF"/>
+        <w:spacing w:before="100" w:beforeAutospacing="1" w:after="100" w:afterAutospacing="1"/>
+        <w:rPr>
+          <w:rFonts w:ascii="Times New Roman" w:eastAsia="Times New Roman" w:hAnsi="Times New Roman" w:cs="Times New Roman"/>
+          <w:color w:val="1F2328"/>
+          <w:kern w:val="0"/>
+          <w14:ligatures w14:val="none"/>
+        </w:rPr>
+      </w:pPr>
+      <w:r>
+        <w:rPr>
+          <w:rFonts w:ascii="Times New Roman" w:eastAsia="Times New Roman" w:hAnsi="Times New Roman" w:cs="Times New Roman"/>
+          <w:color w:val="1F2328"/>
+          <w:kern w:val="0"/>
+          <w14:ligatures w14:val="none"/>
+        </w:rPr>
+        <w:t>Cut the filter into “pie slices” to get the desired weight based on your calculations above. Start by cutting it in quarters, and then a smaller slice from one quarter.</w:t>
+      </w:r>
+    </w:p>
+    <w:p>
+      <w:pPr>
+        <w:numPr>
+          <w:ilvl w:val="2"/>
+          <w:numId w:val="3"/>
+        </w:numPr>
+        <w:shd w:val="clear" w:color="auto" w:fill="FFFFFF"/>
+        <w:spacing w:before="100" w:beforeAutospacing="1" w:after="100" w:afterAutospacing="1"/>
+        <w:rPr>
+          <w:rFonts w:ascii="Times New Roman" w:eastAsia="Times New Roman" w:hAnsi="Times New Roman" w:cs="Times New Roman"/>
+          <w:color w:val="1F2328"/>
+          <w:kern w:val="0"/>
+          <w14:ligatures w14:val="none"/>
+        </w:rPr>
+      </w:pPr>
+      <w:r>
+        <w:rPr>
+          <w:rFonts w:ascii="Times New Roman" w:eastAsia="Times New Roman" w:hAnsi="Times New Roman" w:cs="Times New Roman"/>
+          <w:color w:val="1F2328"/>
+          <w:kern w:val="0"/>
+          <w14:ligatures w14:val="none"/>
+        </w:rPr>
+        <w:t>E.g. ¼ of a 400mg filter will be ~100mg. Then cut a ~30mg slice out of that piece.</w:t>
+      </w:r>
+    </w:p>
+    <w:p>
+      <w:pPr>
+        <w:numPr>
+          <w:ilvl w:val="2"/>
+          <w:numId w:val="3"/>
+        </w:numPr>
+        <w:shd w:val="clear" w:color="auto" w:fill="FFFFFF"/>
+        <w:spacing w:before="100" w:beforeAutospacing="1" w:after="100" w:afterAutospacing="1"/>
+        <w:rPr>
+          <w:rFonts w:ascii="Times New Roman" w:eastAsia="Times New Roman" w:hAnsi="Times New Roman" w:cs="Times New Roman"/>
+          <w:color w:val="1F2328"/>
+          <w:kern w:val="0"/>
+          <w14:ligatures w14:val="none"/>
+        </w:rPr>
+      </w:pPr>
+      <w:r>
+        <w:rPr>
+          <w:rFonts w:ascii="Times New Roman" w:eastAsia="Times New Roman" w:hAnsi="Times New Roman" w:cs="Times New Roman"/>
+          <w:color w:val="1F2328"/>
+          <w:kern w:val="0"/>
+          <w14:ligatures w14:val="none"/>
+        </w:rPr>
+        <w:t>Avoid any large “chunks” and only use areas where it looks homogenous across the filter.</w:t>
+      </w:r>
+    </w:p>
+    <w:p>
+      <w:pPr>
+        <w:numPr>
+          <w:ilvl w:val="1"/>
+          <w:numId w:val="3"/>
+        </w:numPr>
+        <w:shd w:val="clear" w:color="auto" w:fill="FFFFFF"/>
+        <w:spacing w:before="100" w:beforeAutospacing="1" w:after="100" w:afterAutospacing="1"/>
+        <w:rPr>
+          <w:rFonts w:ascii="Times New Roman" w:eastAsia="Times New Roman" w:hAnsi="Times New Roman" w:cs="Times New Roman"/>
+          <w:color w:val="1F2328"/>
+          <w:kern w:val="0"/>
+          <w14:ligatures w14:val="none"/>
+        </w:rPr>
+      </w:pPr>
+      <w:r>
+        <w:rPr>
+          <w:rFonts w:ascii="Times New Roman" w:eastAsia="Times New Roman" w:hAnsi="Times New Roman" w:cs="Times New Roman"/>
+          <w:color w:val="1F2328"/>
+          <w:kern w:val="0"/>
+          <w14:ligatures w14:val="none"/>
+        </w:rPr>
+        <w:t>Weigh your filter slice on a piece of sterile/combusted tinfoil, trimming down until you have achieved close to (within 5mg) your target weight.</w:t>
+      </w:r>
+    </w:p>
+    <w:p>
+      <w:pPr>
+        <w:numPr>
+          <w:ilvl w:val="1"/>
+          <w:numId w:val="3"/>
+        </w:numPr>
+        <w:shd w:val="clear" w:color="auto" w:fill="FFFFFF"/>
+        <w:spacing w:before="100" w:beforeAutospacing="1" w:after="100" w:afterAutospacing="1"/>
+        <w:rPr>
+          <w:rFonts w:ascii="Times New Roman" w:eastAsia="Times New Roman" w:hAnsi="Times New Roman" w:cs="Times New Roman"/>
+          <w:color w:val="1F2328"/>
+          <w:kern w:val="0"/>
+          <w14:ligatures w14:val="none"/>
+        </w:rPr>
+      </w:pPr>
+      <w:r>
+        <w:rPr>
+          <w:rFonts w:ascii="Times New Roman" w:eastAsia="Times New Roman" w:hAnsi="Times New Roman" w:cs="Times New Roman"/>
+          <w:color w:val="1F2328"/>
+          <w:kern w:val="0"/>
+          <w14:ligatures w14:val="none"/>
+        </w:rPr>
+        <w:t>Once you have achieved your correct weight, cut</w:t>
+      </w:r>
+      <w:r>
+        <w:rPr>
+          <w:rFonts w:ascii="Times New Roman" w:eastAsia="Times New Roman" w:hAnsi="Times New Roman" w:cs="Times New Roman"/>
+          <w:color w:val="1F2328"/>
+          <w:kern w:val="0"/>
+          <w14:ligatures w14:val="none"/>
+        </w:rPr>
+        <w:t xml:space="preserve"> your filter slice into </w:t>
+      </w:r>
+      <w:r>
+        <w:rPr>
+          <w:rFonts w:ascii="Times New Roman" w:eastAsia="Times New Roman" w:hAnsi="Times New Roman" w:cs="Times New Roman"/>
+          <w:color w:val="1F2328"/>
+          <w:kern w:val="0"/>
+          <w14:ligatures w14:val="none"/>
+        </w:rPr>
+        <w:t>a few</w:t>
+      </w:r>
+      <w:r>
+        <w:rPr>
+          <w:rFonts w:ascii="Times New Roman" w:eastAsia="Times New Roman" w:hAnsi="Times New Roman" w:cs="Times New Roman"/>
+          <w:color w:val="1F2328"/>
+          <w:kern w:val="0"/>
+          <w14:ligatures w14:val="none"/>
+        </w:rPr>
+        <w:t xml:space="preserve"> small pieces</w:t>
+      </w:r>
+      <w:r>
+        <w:rPr>
+          <w:rFonts w:ascii="Times New Roman" w:eastAsia="Times New Roman" w:hAnsi="Times New Roman" w:cs="Times New Roman"/>
+          <w:color w:val="1F2328"/>
+          <w:kern w:val="0"/>
+          <w14:ligatures w14:val="none"/>
+        </w:rPr>
+        <w:t xml:space="preserve"> that will fit inside a capsule.</w:t>
+      </w:r>
+    </w:p>
+    <w:p>
+      <w:pPr>
+        <w:numPr>
+          <w:ilvl w:val="1"/>
+          <w:numId w:val="3"/>
+        </w:numPr>
+        <w:shd w:val="clear" w:color="auto" w:fill="FFFFFF"/>
+        <w:spacing w:before="100" w:beforeAutospacing="1" w:after="100" w:afterAutospacing="1"/>
+        <w:rPr>
+          <w:rFonts w:ascii="Times New Roman" w:eastAsia="Times New Roman" w:hAnsi="Times New Roman" w:cs="Times New Roman"/>
+          <w:color w:val="1F2328"/>
+          <w:kern w:val="0"/>
+          <w14:ligatures w14:val="none"/>
+        </w:rPr>
+      </w:pPr>
+      <w:r>
+        <w:rPr>
+          <w:rFonts w:ascii="Times New Roman" w:eastAsia="Times New Roman" w:hAnsi="Times New Roman" w:cs="Times New Roman"/>
+          <w:color w:val="1F2328"/>
+          <w:kern w:val="0"/>
+          <w14:ligatures w14:val="none"/>
+        </w:rPr>
+        <w:t>R</w:t>
+      </w:r>
+      <w:r>
+        <w:rPr>
+          <w:rFonts w:ascii="Times New Roman" w:eastAsia="Times New Roman" w:hAnsi="Times New Roman" w:cs="Times New Roman"/>
+          <w:color w:val="1F2328"/>
+          <w:kern w:val="0"/>
+          <w14:ligatures w14:val="none"/>
+        </w:rPr>
+        <w:t>ecord replicate information in sample ID for filters</w:t>
+      </w:r>
+      <w:r>
+        <w:rPr>
+          <w:rFonts w:ascii="Times New Roman" w:eastAsia="Times New Roman" w:hAnsi="Times New Roman" w:cs="Times New Roman"/>
+          <w:color w:val="1F2328"/>
+          <w:kern w:val="0"/>
+          <w14:ligatures w14:val="none"/>
+        </w:rPr>
+        <w:t>!!</w:t>
+      </w:r>
+    </w:p>
+    <w:p>
+      <w:pPr>
+        <w:numPr>
+          <w:ilvl w:val="1"/>
+          <w:numId w:val="3"/>
+        </w:numPr>
+        <w:shd w:val="clear" w:color="auto" w:fill="FFFFFF"/>
+        <w:spacing w:before="100" w:beforeAutospacing="1" w:after="100" w:afterAutospacing="1"/>
+        <w:rPr>
+          <w:rFonts w:ascii="Times New Roman" w:eastAsia="Times New Roman" w:hAnsi="Times New Roman" w:cs="Times New Roman"/>
+          <w:color w:val="1F2328"/>
+          <w:kern w:val="0"/>
+          <w14:ligatures w14:val="none"/>
+        </w:rPr>
+      </w:pPr>
+      <w:r>
+        <w:rPr>
+          <w:rFonts w:ascii="Times New Roman" w:eastAsia="Times New Roman" w:hAnsi="Times New Roman" w:cs="Times New Roman"/>
+          <w:color w:val="1F2328"/>
+          <w:kern w:val="0"/>
+          <w14:ligatures w14:val="none"/>
+        </w:rPr>
+        <w:t>Put your “weighing plate” on the scale. Zero the scale.</w:t>
+      </w:r>
+    </w:p>
+    <w:p>
+      <w:pPr>
+        <w:numPr>
+          <w:ilvl w:val="1"/>
+          <w:numId w:val="3"/>
+        </w:numPr>
+        <w:shd w:val="clear" w:color="auto" w:fill="FFFFFF"/>
+        <w:spacing w:before="100" w:beforeAutospacing="1" w:after="100" w:afterAutospacing="1"/>
+        <w:rPr>
+          <w:rFonts w:ascii="Times New Roman" w:eastAsia="Times New Roman" w:hAnsi="Times New Roman" w:cs="Times New Roman"/>
+          <w:color w:val="1F2328"/>
+          <w:kern w:val="0"/>
+          <w14:ligatures w14:val="none"/>
+        </w:rPr>
+      </w:pPr>
+      <w:r>
+        <w:rPr>
+          <w:rFonts w:ascii="Times New Roman" w:eastAsia="Times New Roman" w:hAnsi="Times New Roman" w:cs="Times New Roman"/>
+          <w:color w:val="1F2328"/>
+          <w:kern w:val="0"/>
+          <w14:ligatures w14:val="none"/>
+        </w:rPr>
+        <w:t>Place a silver (Ag) capsule in a well in the middle and record capsule weight (</w:t>
+      </w:r>
+      <w:proofErr w:type="spellStart"/>
+      <w:r>
+        <w:rPr>
+          <w:rFonts w:ascii="Times New Roman" w:eastAsia="Times New Roman" w:hAnsi="Times New Roman" w:cs="Times New Roman"/>
+          <w:color w:val="1F2328"/>
+          <w:kern w:val="0"/>
+          <w14:ligatures w14:val="none"/>
+        </w:rPr>
+        <w:t>ag_capsule_mg</w:t>
+      </w:r>
+      <w:proofErr w:type="spellEnd"/>
+      <w:r>
+        <w:rPr>
+          <w:rFonts w:ascii="Times New Roman" w:eastAsia="Times New Roman" w:hAnsi="Times New Roman" w:cs="Times New Roman"/>
+          <w:color w:val="1F2328"/>
+          <w:kern w:val="0"/>
+          <w14:ligatures w14:val="none"/>
+        </w:rPr>
+        <w:t>). Zero the scale.</w:t>
+      </w:r>
+    </w:p>
+    <w:p>
+      <w:pPr>
+        <w:numPr>
+          <w:ilvl w:val="1"/>
+          <w:numId w:val="3"/>
+        </w:numPr>
+        <w:shd w:val="clear" w:color="auto" w:fill="FFFFFF"/>
+        <w:spacing w:before="100" w:beforeAutospacing="1" w:after="100" w:afterAutospacing="1"/>
+        <w:rPr>
+          <w:rFonts w:ascii="Times New Roman" w:eastAsia="Times New Roman" w:hAnsi="Times New Roman" w:cs="Times New Roman"/>
+          <w:color w:val="1F2328"/>
+          <w:kern w:val="0"/>
+          <w14:ligatures w14:val="none"/>
+        </w:rPr>
+      </w:pPr>
+      <w:r>
+        <w:rPr>
+          <w:rFonts w:ascii="Times New Roman" w:eastAsia="Times New Roman" w:hAnsi="Times New Roman" w:cs="Times New Roman"/>
+          <w:color w:val="1F2328"/>
+          <w:kern w:val="0"/>
+          <w14:ligatures w14:val="none"/>
+        </w:rPr>
+        <w:t>Using tweezers, take all the pieces of your filter slice and put them into your silver capsule.</w:t>
+      </w:r>
+    </w:p>
+    <w:p>
+      <w:pPr>
+        <w:numPr>
+          <w:ilvl w:val="1"/>
+          <w:numId w:val="3"/>
+        </w:numPr>
+        <w:shd w:val="clear" w:color="auto" w:fill="FFFFFF"/>
+        <w:spacing w:before="100" w:beforeAutospacing="1" w:after="100" w:afterAutospacing="1"/>
+        <w:rPr>
+          <w:rFonts w:ascii="Times New Roman" w:eastAsia="Times New Roman" w:hAnsi="Times New Roman" w:cs="Times New Roman"/>
+          <w:color w:val="1F2328"/>
+          <w:kern w:val="0"/>
+          <w14:ligatures w14:val="none"/>
+        </w:rPr>
+      </w:pPr>
+      <w:r>
+        <w:rPr>
+          <w:rFonts w:ascii="Times New Roman" w:eastAsia="Times New Roman" w:hAnsi="Times New Roman" w:cs="Times New Roman"/>
+          <w:color w:val="1F2328"/>
+          <w:kern w:val="0"/>
+          <w14:ligatures w14:val="none"/>
+        </w:rPr>
+        <w:t>After weighing, using tweezers, carefully move capsule with sample into the “acidifying plate”. Record tray location in spreadsheet (</w:t>
+      </w:r>
+      <w:proofErr w:type="spellStart"/>
+      <w:r>
+        <w:rPr>
+          <w:rFonts w:ascii="Times New Roman" w:eastAsia="Times New Roman" w:hAnsi="Times New Roman" w:cs="Times New Roman"/>
+          <w:color w:val="1F2328"/>
+          <w:kern w:val="0"/>
+          <w14:ligatures w14:val="none"/>
+        </w:rPr>
+        <w:t>acid_tray_location</w:t>
+      </w:r>
+      <w:proofErr w:type="spellEnd"/>
+      <w:r>
+        <w:rPr>
+          <w:rFonts w:ascii="Times New Roman" w:eastAsia="Times New Roman" w:hAnsi="Times New Roman" w:cs="Times New Roman"/>
+          <w:color w:val="1F2328"/>
+          <w:kern w:val="0"/>
+          <w14:ligatures w14:val="none"/>
+        </w:rPr>
+        <w:t>)</w:t>
+      </w:r>
+    </w:p>
+    <w:p>
+      <w:pPr>
+        <w:numPr>
+          <w:ilvl w:val="2"/>
+          <w:numId w:val="3"/>
+        </w:numPr>
+        <w:shd w:val="clear" w:color="auto" w:fill="FFFFFF"/>
+        <w:spacing w:before="100" w:beforeAutospacing="1" w:after="100" w:afterAutospacing="1"/>
+        <w:rPr>
+          <w:rFonts w:ascii="Times New Roman" w:eastAsia="Times New Roman" w:hAnsi="Times New Roman" w:cs="Times New Roman"/>
+          <w:color w:val="1F2328"/>
+          <w:kern w:val="0"/>
+          <w14:ligatures w14:val="none"/>
+        </w:rPr>
+      </w:pPr>
+      <w:r>
+        <w:rPr>
+          <w:rFonts w:ascii="Times New Roman" w:eastAsia="Times New Roman" w:hAnsi="Times New Roman" w:cs="Times New Roman"/>
+          <w:color w:val="1F2328"/>
+          <w:kern w:val="0"/>
+          <w14:ligatures w14:val="none"/>
+        </w:rPr>
+        <w:t>E.g. A1, A2, etc.</w:t>
+      </w:r>
+    </w:p>
+    <w:p>
+      <w:pPr>
+        <w:numPr>
+          <w:ilvl w:val="1"/>
+          <w:numId w:val="3"/>
+        </w:numPr>
+        <w:shd w:val="clear" w:color="auto" w:fill="FFFFFF"/>
+        <w:spacing w:before="100" w:beforeAutospacing="1" w:after="100" w:afterAutospacing="1"/>
+        <w:rPr>
+          <w:rFonts w:ascii="Times New Roman" w:eastAsia="Times New Roman" w:hAnsi="Times New Roman" w:cs="Times New Roman"/>
+          <w:color w:val="1F2328"/>
+          <w:kern w:val="0"/>
+          <w14:ligatures w14:val="none"/>
+        </w:rPr>
+      </w:pPr>
+      <w:r>
+        <w:rPr>
+          <w:rFonts w:ascii="Times New Roman" w:eastAsia="Times New Roman" w:hAnsi="Times New Roman" w:cs="Times New Roman"/>
+          <w:color w:val="1F2328"/>
+          <w:kern w:val="0"/>
+          <w14:ligatures w14:val="none"/>
+        </w:rPr>
+        <w:t>Repeat steps vii-xiv to c</w:t>
+      </w:r>
+      <w:r>
+        <w:rPr>
+          <w:rFonts w:ascii="Times New Roman" w:eastAsia="Times New Roman" w:hAnsi="Times New Roman" w:cs="Times New Roman"/>
+          <w:color w:val="1F2328"/>
+          <w:kern w:val="0"/>
+          <w14:ligatures w14:val="none"/>
+        </w:rPr>
+        <w:t>ut 3 slices per filter as triplicate samples</w:t>
+      </w:r>
+      <w:r>
+        <w:rPr>
+          <w:rFonts w:ascii="Times New Roman" w:eastAsia="Times New Roman" w:hAnsi="Times New Roman" w:cs="Times New Roman"/>
+          <w:color w:val="1F2328"/>
+          <w:kern w:val="0"/>
+          <w14:ligatures w14:val="none"/>
+        </w:rPr>
+        <w:t xml:space="preserve"> </w:t>
+      </w:r>
+      <w:r>
+        <w:rPr>
+          <w:rFonts w:ascii="Times New Roman" w:eastAsia="Times New Roman" w:hAnsi="Times New Roman" w:cs="Times New Roman"/>
+          <w:color w:val="1F2328"/>
+          <w:kern w:val="0"/>
+          <w14:ligatures w14:val="none"/>
+        </w:rPr>
+        <w:t>from different areas around the filter.</w:t>
+      </w:r>
+    </w:p>
+    <w:p>
+      <w:pPr>
+        <w:numPr>
+          <w:ilvl w:val="1"/>
+          <w:numId w:val="3"/>
+        </w:numPr>
+        <w:shd w:val="clear" w:color="auto" w:fill="FFFFFF"/>
+        <w:spacing w:before="100" w:beforeAutospacing="1" w:after="100" w:afterAutospacing="1"/>
+        <w:rPr>
+          <w:rFonts w:ascii="Times New Roman" w:eastAsia="Times New Roman" w:hAnsi="Times New Roman" w:cs="Times New Roman"/>
+          <w:color w:val="1F2328"/>
+          <w:kern w:val="0"/>
+          <w14:ligatures w14:val="none"/>
+        </w:rPr>
+      </w:pPr>
+      <w:r>
+        <w:rPr>
+          <w:rFonts w:ascii="Times New Roman" w:eastAsia="Times New Roman" w:hAnsi="Times New Roman" w:cs="Times New Roman"/>
+          <w:color w:val="1F2328"/>
+          <w:kern w:val="0"/>
+          <w14:ligatures w14:val="none"/>
+        </w:rPr>
+        <w:t xml:space="preserve">Add </w:t>
+      </w:r>
+      <w:r>
+        <w:rPr>
+          <w:rFonts w:ascii="Times New Roman" w:eastAsia="Times New Roman" w:hAnsi="Times New Roman" w:cs="Times New Roman"/>
+          <w:color w:val="212121"/>
+          <w:kern w:val="0"/>
+          <w14:ligatures w14:val="none"/>
+        </w:rPr>
+        <w:t>10μL of 6N HCl to remove inorganic carbonates</w:t>
+      </w:r>
+      <w:r>
+        <w:rPr>
+          <w:rFonts w:ascii="Times New Roman" w:eastAsia="Times New Roman" w:hAnsi="Times New Roman" w:cs="Times New Roman"/>
+          <w:color w:val="212121"/>
+          <w:kern w:val="0"/>
+          <w14:ligatures w14:val="none"/>
+        </w:rPr>
+        <w:t>. If sample bubbles, add an additional 10</w:t>
+      </w:r>
+      <w:r>
+        <w:rPr>
+          <w:rFonts w:ascii="Times New Roman" w:eastAsia="Times New Roman" w:hAnsi="Times New Roman" w:cs="Times New Roman"/>
+          <w:color w:val="212121"/>
+          <w:kern w:val="0"/>
+          <w14:ligatures w14:val="none"/>
+        </w:rPr>
+        <w:t>μL</w:t>
+      </w:r>
+      <w:r>
+        <w:rPr>
+          <w:rFonts w:ascii="Times New Roman" w:eastAsia="Times New Roman" w:hAnsi="Times New Roman" w:cs="Times New Roman"/>
+          <w:color w:val="212121"/>
+          <w:kern w:val="0"/>
+          <w14:ligatures w14:val="none"/>
+        </w:rPr>
+        <w:t xml:space="preserve"> until bubbling ceases (this tells you that you should have removed all inorganic carbonates). Be careful to wet the entire sample during this step.</w:t>
+      </w:r>
+      <w:r>
+        <w:rPr>
+          <w:rFonts w:ascii="Times New Roman" w:eastAsia="Times New Roman" w:hAnsi="Times New Roman" w:cs="Times New Roman"/>
+          <w:color w:val="212121"/>
+          <w:kern w:val="0"/>
+          <w14:ligatures w14:val="none"/>
+        </w:rPr>
+        <w:t xml:space="preserve"> For filters since they are bigger you might need a bit more, adjust as needed.</w:t>
+      </w:r>
+    </w:p>
+    <w:p>
+      <w:pPr>
+        <w:numPr>
+          <w:ilvl w:val="1"/>
+          <w:numId w:val="3"/>
+        </w:numPr>
+        <w:shd w:val="clear" w:color="auto" w:fill="FFFFFF"/>
+        <w:spacing w:before="100" w:beforeAutospacing="1" w:after="100" w:afterAutospacing="1"/>
+        <w:rPr>
+          <w:rFonts w:ascii="Times New Roman" w:eastAsia="Times New Roman" w:hAnsi="Times New Roman" w:cs="Times New Roman"/>
+          <w:color w:val="1F2328"/>
+          <w:kern w:val="0"/>
+          <w14:ligatures w14:val="none"/>
+        </w:rPr>
+      </w:pPr>
+      <w:r>
+        <w:rPr>
+          <w:rFonts w:ascii="Times New Roman" w:eastAsia="Times New Roman" w:hAnsi="Times New Roman" w:cs="Times New Roman"/>
+          <w:color w:val="1F2328"/>
+          <w:kern w:val="0"/>
+          <w14:ligatures w14:val="none"/>
+        </w:rPr>
+        <w:t>Put acidifying plate into the fume hood overnight-24hrs to evaporate</w:t>
+      </w:r>
+    </w:p>
+    <w:p>
+      <w:pPr>
+        <w:numPr>
+          <w:ilvl w:val="1"/>
+          <w:numId w:val="3"/>
+        </w:numPr>
+        <w:shd w:val="clear" w:color="auto" w:fill="FFFFFF"/>
+        <w:spacing w:before="100" w:beforeAutospacing="1" w:after="100" w:afterAutospacing="1"/>
+        <w:rPr>
+          <w:rFonts w:ascii="Times New Roman" w:eastAsia="Times New Roman" w:hAnsi="Times New Roman" w:cs="Times New Roman"/>
+          <w:color w:val="1F2328"/>
+          <w:kern w:val="0"/>
+          <w14:ligatures w14:val="none"/>
+        </w:rPr>
+      </w:pPr>
+      <w:r>
+        <w:rPr>
+          <w:rFonts w:ascii="Times New Roman" w:eastAsia="Times New Roman" w:hAnsi="Times New Roman" w:cs="Times New Roman"/>
+          <w:color w:val="1F2328"/>
+          <w:kern w:val="0"/>
+          <w14:ligatures w14:val="none"/>
+        </w:rPr>
+        <w:lastRenderedPageBreak/>
+        <w:t>After 24hrs, put acidifying plate into the drying oven at 60°C for 24hrs to ensure that samples are dry</w:t>
+      </w:r>
+    </w:p>
+    <w:p>
+      <w:pPr>
+        <w:numPr>
+          <w:ilvl w:val="1"/>
+          <w:numId w:val="3"/>
+        </w:numPr>
+        <w:shd w:val="clear" w:color="auto" w:fill="FFFFFF"/>
+        <w:spacing w:before="100" w:beforeAutospacing="1" w:after="100" w:afterAutospacing="1"/>
+        <w:rPr>
+          <w:rFonts w:ascii="Times New Roman" w:eastAsia="Times New Roman" w:hAnsi="Times New Roman" w:cs="Times New Roman"/>
+          <w:color w:val="1F2328"/>
+          <w:kern w:val="0"/>
+          <w14:ligatures w14:val="none"/>
+        </w:rPr>
+      </w:pPr>
+      <w:r>
+        <w:rPr>
+          <w:rFonts w:ascii="Times New Roman" w:eastAsia="Times New Roman" w:hAnsi="Times New Roman" w:cs="Times New Roman"/>
+          <w:color w:val="1F2328"/>
+          <w:kern w:val="0"/>
+          <w14:ligatures w14:val="none"/>
+        </w:rPr>
+        <w:t>Re-weigh acidified samples and record weight (</w:t>
+      </w:r>
+      <w:proofErr w:type="spellStart"/>
+      <w:r>
+        <w:rPr>
+          <w:rFonts w:ascii="Times New Roman" w:eastAsia="Times New Roman" w:hAnsi="Times New Roman" w:cs="Times New Roman"/>
+          <w:color w:val="1F2328"/>
+          <w:kern w:val="0"/>
+          <w14:ligatures w14:val="none"/>
+        </w:rPr>
+        <w:t>acid_capsule_mg</w:t>
+      </w:r>
+      <w:proofErr w:type="spellEnd"/>
+      <w:r>
+        <w:rPr>
+          <w:rFonts w:ascii="Times New Roman" w:eastAsia="Times New Roman" w:hAnsi="Times New Roman" w:cs="Times New Roman"/>
+          <w:color w:val="1F2328"/>
+          <w:kern w:val="0"/>
+          <w14:ligatures w14:val="none"/>
+        </w:rPr>
+        <w:t>). Subtract your capsule weight (</w:t>
+      </w:r>
+      <w:proofErr w:type="spellStart"/>
+      <w:r>
+        <w:rPr>
+          <w:rFonts w:ascii="Times New Roman" w:eastAsia="Times New Roman" w:hAnsi="Times New Roman" w:cs="Times New Roman"/>
+          <w:color w:val="1F2328"/>
+          <w:kern w:val="0"/>
+          <w14:ligatures w14:val="none"/>
+        </w:rPr>
+        <w:t>ag_capsule_mg</w:t>
+      </w:r>
+      <w:proofErr w:type="spellEnd"/>
+      <w:r>
+        <w:rPr>
+          <w:rFonts w:ascii="Times New Roman" w:eastAsia="Times New Roman" w:hAnsi="Times New Roman" w:cs="Times New Roman"/>
+          <w:color w:val="1F2328"/>
+          <w:kern w:val="0"/>
+          <w14:ligatures w14:val="none"/>
+        </w:rPr>
+        <w:t>) from this weight (</w:t>
+      </w:r>
+      <w:proofErr w:type="spellStart"/>
+      <w:r>
+        <w:rPr>
+          <w:rFonts w:ascii="Times New Roman" w:eastAsia="Times New Roman" w:hAnsi="Times New Roman" w:cs="Times New Roman"/>
+          <w:color w:val="1F2328"/>
+          <w:kern w:val="0"/>
+          <w14:ligatures w14:val="none"/>
+        </w:rPr>
+        <w:t>acid_capsule_mg</w:t>
+      </w:r>
+      <w:proofErr w:type="spellEnd"/>
+      <w:r>
+        <w:rPr>
+          <w:rFonts w:ascii="Times New Roman" w:eastAsia="Times New Roman" w:hAnsi="Times New Roman" w:cs="Times New Roman"/>
+          <w:color w:val="1F2328"/>
+          <w:kern w:val="0"/>
+          <w14:ligatures w14:val="none"/>
+        </w:rPr>
+        <w:t>) to calculate your final sample weight (</w:t>
+      </w:r>
+      <w:proofErr w:type="spellStart"/>
+      <w:r>
+        <w:rPr>
+          <w:rFonts w:ascii="Times New Roman" w:eastAsia="Times New Roman" w:hAnsi="Times New Roman" w:cs="Times New Roman"/>
+          <w:color w:val="1F2328"/>
+          <w:kern w:val="0"/>
+          <w14:ligatures w14:val="none"/>
+        </w:rPr>
+        <w:t>acid_sample_mg</w:t>
+      </w:r>
+      <w:proofErr w:type="spellEnd"/>
+      <w:r>
+        <w:rPr>
+          <w:rFonts w:ascii="Times New Roman" w:eastAsia="Times New Roman" w:hAnsi="Times New Roman" w:cs="Times New Roman"/>
+          <w:color w:val="1F2328"/>
+          <w:kern w:val="0"/>
+          <w14:ligatures w14:val="none"/>
+        </w:rPr>
+        <w:t xml:space="preserve">). </w:t>
+      </w:r>
+    </w:p>
+    <w:p>
+      <w:pPr>
+        <w:numPr>
+          <w:ilvl w:val="2"/>
+          <w:numId w:val="3"/>
+        </w:numPr>
+        <w:shd w:val="clear" w:color="auto" w:fill="FFFFFF"/>
+        <w:spacing w:before="100" w:beforeAutospacing="1" w:after="100" w:afterAutospacing="1"/>
+        <w:rPr>
+          <w:rFonts w:ascii="Times New Roman" w:eastAsia="Times New Roman" w:hAnsi="Times New Roman" w:cs="Times New Roman"/>
+          <w:color w:val="1F2328"/>
+          <w:kern w:val="0"/>
+          <w14:ligatures w14:val="none"/>
+        </w:rPr>
+      </w:pPr>
+      <w:r>
+        <w:rPr>
+          <w:rFonts w:ascii="Times New Roman" w:eastAsia="Times New Roman" w:hAnsi="Times New Roman" w:cs="Times New Roman"/>
+          <w:color w:val="1F2328"/>
+          <w:kern w:val="0"/>
+          <w14:ligatures w14:val="none"/>
+        </w:rPr>
+        <w:t>You</w:t>
+      </w:r>
+      <w:r>
+        <w:rPr>
+          <w:rFonts w:ascii="Times New Roman" w:eastAsia="Times New Roman" w:hAnsi="Times New Roman" w:cs="Times New Roman"/>
+          <w:color w:val="1F2328"/>
+          <w:kern w:val="0"/>
+          <w14:ligatures w14:val="none"/>
+        </w:rPr>
+        <w:t xml:space="preserve"> will submit </w:t>
+      </w:r>
+      <w:r>
+        <w:rPr>
+          <w:rFonts w:ascii="Times New Roman" w:eastAsia="Times New Roman" w:hAnsi="Times New Roman" w:cs="Times New Roman"/>
+          <w:color w:val="1F2328"/>
+          <w:kern w:val="0"/>
+          <w14:ligatures w14:val="none"/>
+        </w:rPr>
+        <w:t xml:space="preserve">these final sample weights </w:t>
+      </w:r>
+      <w:r>
+        <w:rPr>
+          <w:rFonts w:ascii="Times New Roman" w:eastAsia="Times New Roman" w:hAnsi="Times New Roman" w:cs="Times New Roman"/>
+          <w:color w:val="1F2328"/>
+          <w:kern w:val="0"/>
+          <w14:ligatures w14:val="none"/>
+        </w:rPr>
+        <w:t xml:space="preserve">to the </w:t>
+      </w:r>
+      <w:r>
+        <w:rPr>
+          <w:rFonts w:ascii="Times New Roman" w:eastAsia="Times New Roman" w:hAnsi="Times New Roman" w:cs="Times New Roman"/>
+          <w:color w:val="1F2328"/>
+          <w:kern w:val="0"/>
+          <w14:ligatures w14:val="none"/>
+        </w:rPr>
+        <w:t>isotope facility</w:t>
+      </w:r>
+      <w:r>
+        <w:rPr>
+          <w:rFonts w:ascii="Times New Roman" w:eastAsia="Times New Roman" w:hAnsi="Times New Roman" w:cs="Times New Roman"/>
+          <w:color w:val="1F2328"/>
+          <w:kern w:val="0"/>
+          <w14:ligatures w14:val="none"/>
+        </w:rPr>
+        <w:t>.</w:t>
+      </w:r>
+    </w:p>
+    <w:p>
+      <w:pPr>
+        <w:numPr>
+          <w:ilvl w:val="1"/>
+          <w:numId w:val="3"/>
+        </w:numPr>
+        <w:shd w:val="clear" w:color="auto" w:fill="FFFFFF"/>
+        <w:spacing w:before="100" w:beforeAutospacing="1" w:after="100" w:afterAutospacing="1"/>
+        <w:rPr>
+          <w:rFonts w:ascii="Times New Roman" w:eastAsia="Times New Roman" w:hAnsi="Times New Roman" w:cs="Times New Roman"/>
+          <w:color w:val="1F2328"/>
+          <w:kern w:val="0"/>
+          <w14:ligatures w14:val="none"/>
+        </w:rPr>
+      </w:pPr>
+      <w:r>
+        <w:rPr>
+          <w:rFonts w:ascii="Times New Roman" w:eastAsia="Times New Roman" w:hAnsi="Times New Roman" w:cs="Times New Roman"/>
+          <w:color w:val="1F2328"/>
+          <w:kern w:val="0"/>
+          <w14:ligatures w14:val="none"/>
+        </w:rPr>
+        <w:t xml:space="preserve">Seal the foil packet with tweezers and fold it into a small ball. See video for method: </w:t>
+      </w:r>
+      <w:hyperlink r:id="rId12" w:history="1">
+        <w:r>
+          <w:rPr>
+            <w:rStyle w:val="Hyperlink"/>
+            <w:rFonts w:ascii="Times New Roman" w:hAnsi="Times New Roman" w:cs="Times New Roman"/>
+            <w:color w:val="1155CC"/>
+          </w:rPr>
+          <w:t>https://www.youtube.com/watch?v=VfF6yuiKWrA</w:t>
+        </w:r>
+      </w:hyperlink>
+    </w:p>
+    <w:p>
+      <w:pPr>
+        <w:numPr>
+          <w:ilvl w:val="1"/>
+          <w:numId w:val="3"/>
+        </w:numPr>
+        <w:shd w:val="clear" w:color="auto" w:fill="FFFFFF"/>
+        <w:spacing w:before="100" w:beforeAutospacing="1" w:after="100" w:afterAutospacing="1"/>
+        <w:rPr>
+          <w:rFonts w:ascii="Times New Roman" w:eastAsia="Times New Roman" w:hAnsi="Times New Roman" w:cs="Times New Roman"/>
+          <w:color w:val="1F2328"/>
+          <w:kern w:val="0"/>
+          <w14:ligatures w14:val="none"/>
+        </w:rPr>
+      </w:pPr>
+      <w:r>
+        <w:rPr>
+          <w:rFonts w:ascii="Times New Roman" w:hAnsi="Times New Roman" w:cs="Times New Roman"/>
+        </w:rPr>
+        <w:t xml:space="preserve">Place folded capsule into a tin capsule and refold (same as above video). </w:t>
+      </w:r>
+    </w:p>
+    <w:p>
+      <w:pPr>
+        <w:numPr>
+          <w:ilvl w:val="2"/>
+          <w:numId w:val="3"/>
+        </w:numPr>
+        <w:shd w:val="clear" w:color="auto" w:fill="FFFFFF"/>
+        <w:spacing w:before="100" w:beforeAutospacing="1" w:after="100" w:afterAutospacing="1"/>
+        <w:rPr>
+          <w:rFonts w:ascii="Times New Roman" w:eastAsia="Times New Roman" w:hAnsi="Times New Roman" w:cs="Times New Roman"/>
+          <w:color w:val="1F2328"/>
+          <w:kern w:val="0"/>
+          <w14:ligatures w14:val="none"/>
+        </w:rPr>
+      </w:pPr>
+      <w:r>
+        <w:rPr>
+          <w:rFonts w:ascii="Times New Roman" w:hAnsi="Times New Roman" w:cs="Times New Roman"/>
+        </w:rPr>
+        <w:t xml:space="preserve">See here for encapsulation tips and what it should look like: </w:t>
+      </w:r>
+      <w:hyperlink r:id="rId13" w:history="1">
+        <w:r>
+          <w:rPr>
+            <w:rStyle w:val="Hyperlink"/>
+            <w:rFonts w:ascii="Times New Roman" w:hAnsi="Times New Roman" w:cs="Times New Roman"/>
+          </w:rPr>
+          <w:t>https://stableisotopefacility.ucdavis.edu/encapsulation-tips-carbon-and-nitrogen-solids</w:t>
+        </w:r>
+      </w:hyperlink>
+    </w:p>
+    <w:p>
+      <w:pPr>
+        <w:numPr>
+          <w:ilvl w:val="2"/>
+          <w:numId w:val="3"/>
+        </w:numPr>
+        <w:shd w:val="clear" w:color="auto" w:fill="FFFFFF"/>
+        <w:spacing w:before="100" w:beforeAutospacing="1" w:after="100" w:afterAutospacing="1"/>
+        <w:rPr>
+          <w:rFonts w:ascii="Times New Roman" w:eastAsia="Times New Roman" w:hAnsi="Times New Roman" w:cs="Times New Roman"/>
+          <w:color w:val="1F2328"/>
+          <w:kern w:val="0"/>
+          <w14:ligatures w14:val="none"/>
+        </w:rPr>
+      </w:pPr>
+      <w:r>
+        <w:rPr>
+          <w:rFonts w:ascii="Times New Roman" w:hAnsi="Times New Roman" w:cs="Times New Roman"/>
+        </w:rPr>
+        <w:t>I often will roll the sample around between my gloved fingers to make sure it’s in a nice ball at the end.</w:t>
+      </w:r>
+    </w:p>
+    <w:p>
+      <w:pPr>
+        <w:numPr>
+          <w:ilvl w:val="2"/>
+          <w:numId w:val="3"/>
+        </w:numPr>
+        <w:shd w:val="clear" w:color="auto" w:fill="FFFFFF"/>
+        <w:spacing w:before="100" w:beforeAutospacing="1" w:after="100" w:afterAutospacing="1"/>
+        <w:rPr>
+          <w:rFonts w:ascii="Times New Roman" w:eastAsia="Times New Roman" w:hAnsi="Times New Roman" w:cs="Times New Roman"/>
+          <w:color w:val="1F2328"/>
+          <w:kern w:val="0"/>
+          <w14:ligatures w14:val="none"/>
+        </w:rPr>
+      </w:pPr>
+      <w:r>
+        <w:rPr>
+          <w:rFonts w:ascii="Times New Roman" w:hAnsi="Times New Roman" w:cs="Times New Roman"/>
+        </w:rPr>
+        <w:t>Make sure it is not “leaking” any sample – if it is, take it out of the tin capsule and re-wrap it better</w:t>
+      </w:r>
+    </w:p>
+    <w:p>
+      <w:pPr>
+        <w:numPr>
+          <w:ilvl w:val="2"/>
+          <w:numId w:val="3"/>
+        </w:numPr>
+        <w:shd w:val="clear" w:color="auto" w:fill="FFFFFF"/>
+        <w:spacing w:before="100" w:beforeAutospacing="1" w:after="100" w:afterAutospacing="1"/>
+        <w:rPr>
+          <w:rFonts w:ascii="Times New Roman" w:eastAsia="Times New Roman" w:hAnsi="Times New Roman" w:cs="Times New Roman"/>
+          <w:color w:val="1F2328"/>
+          <w:kern w:val="0"/>
+          <w14:ligatures w14:val="none"/>
+        </w:rPr>
+      </w:pPr>
+      <w:r>
+        <w:rPr>
+          <w:rFonts w:ascii="Times New Roman" w:hAnsi="Times New Roman" w:cs="Times New Roman"/>
+        </w:rPr>
+        <w:t xml:space="preserve">Don’t touch with fingers when in Ag capsule! </w:t>
+      </w:r>
+    </w:p>
+    <w:p>
+      <w:pPr>
+        <w:numPr>
+          <w:ilvl w:val="1"/>
+          <w:numId w:val="3"/>
+        </w:numPr>
+        <w:shd w:val="clear" w:color="auto" w:fill="FFFFFF"/>
+        <w:spacing w:before="100" w:beforeAutospacing="1" w:after="100" w:afterAutospacing="1"/>
+        <w:rPr>
+          <w:rFonts w:ascii="Times New Roman" w:eastAsia="Times New Roman" w:hAnsi="Times New Roman" w:cs="Times New Roman"/>
+          <w:color w:val="1F2328"/>
+          <w:kern w:val="0"/>
+          <w14:ligatures w14:val="none"/>
+        </w:rPr>
+      </w:pPr>
+      <w:r>
+        <w:rPr>
+          <w:rFonts w:ascii="Times New Roman" w:hAnsi="Times New Roman" w:cs="Times New Roman"/>
+        </w:rPr>
+        <w:t>Place sample into final labeled plate, record location in tray (</w:t>
+      </w:r>
+      <w:proofErr w:type="spellStart"/>
+      <w:r>
+        <w:rPr>
+          <w:rFonts w:ascii="Times New Roman" w:hAnsi="Times New Roman" w:cs="Times New Roman"/>
+        </w:rPr>
+        <w:t>final_tray_location</w:t>
+      </w:r>
+      <w:proofErr w:type="spellEnd"/>
+      <w:r>
+        <w:rPr>
+          <w:rFonts w:ascii="Times New Roman" w:hAnsi="Times New Roman" w:cs="Times New Roman"/>
+        </w:rPr>
+        <w:t>). Re-tape plate</w:t>
+      </w:r>
+    </w:p>
+    <w:p>
+      <w:pPr>
+        <w:numPr>
+          <w:ilvl w:val="1"/>
+          <w:numId w:val="3"/>
+        </w:numPr>
+        <w:shd w:val="clear" w:color="auto" w:fill="FFFFFF"/>
+        <w:spacing w:before="100" w:beforeAutospacing="1" w:after="100" w:afterAutospacing="1"/>
+        <w:rPr>
+          <w:rFonts w:ascii="Times New Roman" w:eastAsia="Times New Roman" w:hAnsi="Times New Roman" w:cs="Times New Roman"/>
+          <w:color w:val="1F2328"/>
+          <w:kern w:val="0"/>
+          <w14:ligatures w14:val="none"/>
+        </w:rPr>
+      </w:pPr>
+      <w:r>
+        <w:rPr>
+          <w:rFonts w:ascii="Times New Roman" w:hAnsi="Times New Roman" w:cs="Times New Roman"/>
+        </w:rPr>
+        <w:t>Place plate back in desiccator until all samples are filled and you are ready to ship.</w:t>
+      </w:r>
+    </w:p>
+    <w:p>
+      <w:pPr>
+        <w:numPr>
+          <w:ilvl w:val="1"/>
+          <w:numId w:val="3"/>
+        </w:numPr>
+        <w:shd w:val="clear" w:color="auto" w:fill="FFFFFF"/>
+        <w:spacing w:before="100" w:beforeAutospacing="1" w:after="100" w:afterAutospacing="1"/>
+        <w:rPr>
+          <w:rFonts w:ascii="Times New Roman" w:eastAsia="Times New Roman" w:hAnsi="Times New Roman" w:cs="Times New Roman"/>
+          <w:color w:val="1F2328"/>
+          <w:kern w:val="0"/>
+          <w14:ligatures w14:val="none"/>
+        </w:rPr>
+      </w:pPr>
+      <w:r>
+        <w:rPr>
+          <w:rFonts w:ascii="Times New Roman" w:hAnsi="Times New Roman" w:cs="Times New Roman"/>
+        </w:rPr>
+        <w:t xml:space="preserve">Once ready to ship, fill out the form on the Cornell isotope (COIL) website: </w:t>
+      </w:r>
+      <w:hyperlink r:id="rId14" w:history="1">
+        <w:r>
+          <w:rPr>
+            <w:rStyle w:val="Hyperlink"/>
+            <w:rFonts w:ascii="Times New Roman" w:hAnsi="Times New Roman" w:cs="Times New Roman"/>
+          </w:rPr>
+          <w:t>https://cobsil.cornell.edu/submitasample/sample-request-form/</w:t>
+        </w:r>
+      </w:hyperlink>
+    </w:p>
+    <w:p>
+      <w:pPr>
+        <w:numPr>
+          <w:ilvl w:val="1"/>
+          <w:numId w:val="3"/>
+        </w:numPr>
+        <w:shd w:val="clear" w:color="auto" w:fill="FFFFFF"/>
+        <w:spacing w:before="100" w:beforeAutospacing="1" w:after="100" w:afterAutospacing="1"/>
+        <w:rPr>
+          <w:rFonts w:ascii="Times New Roman" w:eastAsia="Times New Roman" w:hAnsi="Times New Roman" w:cs="Times New Roman"/>
+          <w:color w:val="1F2328"/>
+          <w:kern w:val="0"/>
+          <w14:ligatures w14:val="none"/>
+        </w:rPr>
+      </w:pPr>
+      <w:r>
+        <w:rPr>
+          <w:rFonts w:ascii="Times New Roman" w:eastAsia="Times New Roman" w:hAnsi="Times New Roman" w:cs="Times New Roman"/>
+          <w:color w:val="1F2328"/>
+          <w:kern w:val="0"/>
+          <w14:ligatures w14:val="none"/>
+        </w:rPr>
+        <w:t>Ship samples according to directions on the COIL website.</w:t>
+      </w:r>
     </w:p>
     <w:p>
       <w:pPr>
@@ -2151,6 +3935,122 @@
     </w:lvl>
   </w:abstractNum>
   <w:abstractNum w:abstractNumId="1" w15:restartNumberingAfterBreak="0">
+    <w:nsid w:val="40233AA6"/>
+    <w:multiLevelType w:val="multilevel"/>
+    <w:tmpl w:val="36246B88"/>
+    <w:lvl w:ilvl="0">
+      <w:start w:val="1"/>
+      <w:numFmt w:val="decimal"/>
+      <w:lvlText w:val="%1."/>
+      <w:lvlJc w:val="left"/>
+      <w:pPr>
+        <w:tabs>
+          <w:tab w:val="num" w:pos="720"/>
+        </w:tabs>
+        <w:ind w:left="720" w:hanging="360"/>
+      </w:pPr>
+      <w:rPr>
+        <w:rFonts w:ascii="Times New Roman" w:eastAsia="Times New Roman" w:hAnsi="Times New Roman" w:cs="Times New Roman"/>
+      </w:rPr>
+    </w:lvl>
+    <w:lvl w:ilvl="1">
+      <w:start w:val="1"/>
+      <w:numFmt w:val="lowerRoman"/>
+      <w:lvlText w:val="%2."/>
+      <w:lvlJc w:val="right"/>
+      <w:pPr>
+        <w:tabs>
+          <w:tab w:val="num" w:pos="1440"/>
+        </w:tabs>
+        <w:ind w:left="1440" w:hanging="360"/>
+      </w:pPr>
+    </w:lvl>
+    <w:lvl w:ilvl="2">
+      <w:start w:val="1"/>
+      <w:numFmt w:val="decimal"/>
+      <w:lvlText w:val="%3."/>
+      <w:lvlJc w:val="left"/>
+      <w:pPr>
+        <w:tabs>
+          <w:tab w:val="num" w:pos="2160"/>
+        </w:tabs>
+        <w:ind w:left="2160" w:hanging="360"/>
+      </w:pPr>
+    </w:lvl>
+    <w:lvl w:ilvl="3" w:tentative="1">
+      <w:start w:val="1"/>
+      <w:numFmt w:val="decimal"/>
+      <w:lvlText w:val="%4."/>
+      <w:lvlJc w:val="left"/>
+      <w:pPr>
+        <w:tabs>
+          <w:tab w:val="num" w:pos="2880"/>
+        </w:tabs>
+        <w:ind w:left="2880" w:hanging="360"/>
+      </w:pPr>
+    </w:lvl>
+    <w:lvl w:ilvl="4" w:tentative="1">
+      <w:start w:val="1"/>
+      <w:numFmt w:val="decimal"/>
+      <w:lvlText w:val="%5."/>
+      <w:lvlJc w:val="left"/>
+      <w:pPr>
+        <w:tabs>
+          <w:tab w:val="num" w:pos="3600"/>
+        </w:tabs>
+        <w:ind w:left="3600" w:hanging="360"/>
+      </w:pPr>
+    </w:lvl>
+    <w:lvl w:ilvl="5" w:tentative="1">
+      <w:start w:val="1"/>
+      <w:numFmt w:val="decimal"/>
+      <w:lvlText w:val="%6."/>
+      <w:lvlJc w:val="left"/>
+      <w:pPr>
+        <w:tabs>
+          <w:tab w:val="num" w:pos="4320"/>
+        </w:tabs>
+        <w:ind w:left="4320" w:hanging="360"/>
+      </w:pPr>
+    </w:lvl>
+    <w:lvl w:ilvl="6" w:tentative="1">
+      <w:start w:val="1"/>
+      <w:numFmt w:val="decimal"/>
+      <w:lvlText w:val="%7."/>
+      <w:lvlJc w:val="left"/>
+      <w:pPr>
+        <w:tabs>
+          <w:tab w:val="num" w:pos="5040"/>
+        </w:tabs>
+        <w:ind w:left="5040" w:hanging="360"/>
+      </w:pPr>
+    </w:lvl>
+    <w:lvl w:ilvl="7" w:tentative="1">
+      <w:start w:val="1"/>
+      <w:numFmt w:val="decimal"/>
+      <w:lvlText w:val="%8."/>
+      <w:lvlJc w:val="left"/>
+      <w:pPr>
+        <w:tabs>
+          <w:tab w:val="num" w:pos="5760"/>
+        </w:tabs>
+        <w:ind w:left="5760" w:hanging="360"/>
+      </w:pPr>
+    </w:lvl>
+    <w:lvl w:ilvl="8" w:tentative="1">
+      <w:start w:val="1"/>
+      <w:numFmt w:val="decimal"/>
+      <w:lvlText w:val="%9."/>
+      <w:lvlJc w:val="left"/>
+      <w:pPr>
+        <w:tabs>
+          <w:tab w:val="num" w:pos="6480"/>
+        </w:tabs>
+        <w:ind w:left="6480" w:hanging="360"/>
+      </w:pPr>
+    </w:lvl>
+  </w:abstractNum>
+  <w:abstractNum w:abstractNumId="2" w15:restartNumberingAfterBreak="0">
     <w:nsid w:val="4FFE0C89"/>
     <w:multiLevelType w:val="multilevel"/>
     <w:tmpl w:val="148EED9E"/>
@@ -2264,10 +4164,13 @@
     </w:lvl>
   </w:abstractNum>
   <w:num w:numId="1" w16cid:durableId="1196769724">
-    <w:abstractNumId w:val="1"/>
+    <w:abstractNumId w:val="2"/>
   </w:num>
   <w:num w:numId="2" w16cid:durableId="826554534">
     <w:abstractNumId w:val="0"/>
+  </w:num>
+  <w:num w:numId="3" w16cid:durableId="958143917">
+    <w:abstractNumId w:val="1"/>
   </w:num>
 </w:numbering>
 </file>

</xml_diff>